<commit_message>
merge from develop branches
</commit_message>
<xml_diff>
--- a/cp_generator/generator/src/main/resources/documents/Variables Generated by CP Generator-V2.docx
+++ b/cp_generator/generator/src/main/resources/documents/Variables Generated by CP Generator-V2.docx
@@ -562,8 +562,6 @@
       <w:r>
         <w:t xml:space="preserve"> if this requirement does not exist</w:t>
       </w:r>
-      <w:bookmarkStart w:id="0" w:name="_GoBack"/>
-      <w:bookmarkEnd w:id="0"/>
       <w:r>
         <w:t xml:space="preserve">. Examples: </w:t>
       </w:r>
@@ -1052,6 +1050,642 @@
         <w:jc w:val="both"/>
         <w:rPr>
           <w:rFonts w:cs="Courier New"/>
+        </w:rPr>
+      </w:pPr>
+    </w:p>
+    <w:p>
+      <w:pPr>
+        <w:jc w:val="both"/>
+        <w:rPr>
+          <w:rFonts w:cs="Courier New"/>
+          <w:b/>
+          <w:u w:val="single"/>
+        </w:rPr>
+      </w:pPr>
+      <w:r>
+        <w:rPr>
+          <w:rFonts w:cs="Courier New"/>
+          <w:b/>
+          <w:u w:val="single"/>
+        </w:rPr>
+        <w:t>Delta Utility Function</w:t>
+      </w:r>
+    </w:p>
+    <w:p>
+      <w:pPr>
+        <w:jc w:val="both"/>
+        <w:rPr>
+          <w:rFonts w:cs="Courier New"/>
+          <w:b/>
+          <w:u w:val="single"/>
+        </w:rPr>
+      </w:pPr>
+    </w:p>
+    <w:p>
+      <w:pPr>
+        <w:jc w:val="both"/>
+        <w:rPr>
+          <w:rFonts w:cs="Courier New"/>
+        </w:rPr>
+      </w:pPr>
+      <w:r>
+        <w:rPr>
+          <w:rFonts w:cs="Courier New"/>
+        </w:rPr>
+        <w:t xml:space="preserve">This function is generated </w:t>
+      </w:r>
+      <w:r>
+        <w:rPr>
+          <w:rFonts w:cs="Courier New"/>
+        </w:rPr>
+        <w:t>by using the optimization requirement</w:t>
+      </w:r>
+      <w:r>
+        <w:rPr>
+          <w:rFonts w:cs="Courier New"/>
+        </w:rPr>
+        <w:t>s</w:t>
+      </w:r>
+      <w:r>
+        <w:rPr>
+          <w:rFonts w:cs="Courier New"/>
+        </w:rPr>
+        <w:t>.</w:t>
+      </w:r>
+      <w:r>
+        <w:rPr>
+          <w:rFonts w:cs="Courier New"/>
+        </w:rPr>
+        <w:t xml:space="preserve"> The function is defined as follows: </w:t>
+      </w:r>
+    </w:p>
+    <w:p>
+      <w:pPr>
+        <w:jc w:val="both"/>
+        <w:rPr>
+          <w:rFonts w:cs="Courier New"/>
+        </w:rPr>
+      </w:pPr>
+      <w:r>
+        <w:rPr>
+          <w:rFonts w:cs="Courier New"/>
+        </w:rPr>
+        <w:br/>
+      </w:r>
+      <m:oMathPara>
+        <m:oMath>
+          <m:r>
+            <m:rPr>
+              <m:sty m:val="p"/>
+            </m:rPr>
+            <w:rPr>
+              <w:rFonts w:ascii="Cambria Math" w:hAnsi="Cambria Math" w:cs="Courier New"/>
+            </w:rPr>
+            <m:t xml:space="preserve"> DeltaUtility</m:t>
+          </m:r>
+          <m:r>
+            <m:rPr>
+              <m:sty m:val="p"/>
+            </m:rPr>
+            <w:rPr>
+              <w:rFonts w:ascii="Cambria Math" w:hAnsi="Cambria Math" w:cs="Courier New"/>
+            </w:rPr>
+            <m:t>(</m:t>
+          </m:r>
+          <m:r>
+            <m:rPr>
+              <m:sty m:val="p"/>
+            </m:rPr>
+            <w:rPr>
+              <w:rFonts w:ascii="Cambria Math" w:hAnsi="Cambria Math" w:cs="Courier New"/>
+            </w:rPr>
+            <m:t>A,B</m:t>
+          </m:r>
+          <m:r>
+            <m:rPr>
+              <m:sty m:val="p"/>
+            </m:rPr>
+            <w:rPr>
+              <w:rFonts w:ascii="Cambria Math" w:hAnsi="Cambria Math" w:cs="Courier New"/>
+            </w:rPr>
+            <m:t>)</m:t>
+          </m:r>
+          <m:r>
+            <m:rPr>
+              <m:sty m:val="p"/>
+            </m:rPr>
+            <w:rPr>
+              <w:rFonts w:ascii="Cambria Math" w:cs="Courier New"/>
+            </w:rPr>
+            <m:t xml:space="preserve">= </m:t>
+          </m:r>
+          <m:f>
+            <m:fPr>
+              <m:ctrlPr>
+                <w:rPr>
+                  <w:rFonts w:ascii="Cambria Math" w:hAnsi="Cambria Math" w:cs="Courier New"/>
+                </w:rPr>
+              </m:ctrlPr>
+            </m:fPr>
+            <m:num>
+              <m:nary>
+                <m:naryPr>
+                  <m:chr m:val="∑"/>
+                  <m:limLoc m:val="undOvr"/>
+                  <m:supHide m:val="1"/>
+                  <m:ctrlPr>
+                    <w:rPr>
+                      <w:rFonts w:ascii="Cambria Math" w:hAnsi="Cambria Math" w:cs="Courier New"/>
+                      <w:i/>
+                    </w:rPr>
+                  </m:ctrlPr>
+                </m:naryPr>
+                <m:sub>
+                  <m:r>
+                    <w:rPr>
+                      <w:rFonts w:ascii="Cambria Math" w:hAnsi="Cambria Math" w:cs="Courier New"/>
+                    </w:rPr>
+                    <m:t>o ϵ OR</m:t>
+                  </m:r>
+                </m:sub>
+                <m:sup/>
+                <m:e>
+                  <m:sSub>
+                    <m:sSubPr>
+                      <m:ctrlPr>
+                        <w:rPr>
+                          <w:rFonts w:ascii="Cambria Math" w:hAnsi="Cambria Math" w:cs="Courier New"/>
+                          <w:i/>
+                        </w:rPr>
+                      </m:ctrlPr>
+                    </m:sSubPr>
+                    <m:e>
+                      <m:r>
+                        <w:rPr>
+                          <w:rFonts w:ascii="Cambria Math" w:hAnsi="Cambria Math" w:cs="Courier New"/>
+                        </w:rPr>
+                        <m:t xml:space="preserve">priority </m:t>
+                      </m:r>
+                    </m:e>
+                    <m:sub>
+                      <m:r>
+                        <w:rPr>
+                          <w:rFonts w:ascii="Cambria Math" w:hAnsi="Cambria Math" w:cs="Courier New"/>
+                        </w:rPr>
+                        <m:t>o</m:t>
+                      </m:r>
+                    </m:sub>
+                  </m:sSub>
+                  <m:r>
+                    <w:rPr>
+                      <w:rFonts w:ascii="Cambria Math" w:hAnsi="Cambria Math" w:cs="Courier New"/>
+                    </w:rPr>
+                    <m:t>*NormalisedUtilityDimension&lt;o&gt;(A,B)</m:t>
+                  </m:r>
+                </m:e>
+              </m:nary>
+            </m:num>
+            <m:den>
+              <m:nary>
+                <m:naryPr>
+                  <m:chr m:val="∑"/>
+                  <m:limLoc m:val="undOvr"/>
+                  <m:supHide m:val="1"/>
+                  <m:ctrlPr>
+                    <w:rPr>
+                      <w:rFonts w:ascii="Cambria Math" w:hAnsi="Cambria Math" w:cs="Courier New"/>
+                      <w:i/>
+                    </w:rPr>
+                  </m:ctrlPr>
+                </m:naryPr>
+                <m:sub>
+                  <m:r>
+                    <w:rPr>
+                      <w:rFonts w:ascii="Cambria Math" w:hAnsi="Cambria Math" w:cs="Courier New"/>
+                    </w:rPr>
+                    <m:t>o ϵ OR</m:t>
+                  </m:r>
+                </m:sub>
+                <m:sup/>
+                <m:e>
+                  <m:sSub>
+                    <m:sSubPr>
+                      <m:ctrlPr>
+                        <w:rPr>
+                          <w:rFonts w:ascii="Cambria Math" w:hAnsi="Cambria Math" w:cs="Courier New"/>
+                          <w:i/>
+                        </w:rPr>
+                      </m:ctrlPr>
+                    </m:sSubPr>
+                    <m:e>
+                      <m:r>
+                        <w:rPr>
+                          <w:rFonts w:ascii="Cambria Math" w:hAnsi="Cambria Math" w:cs="Courier New"/>
+                        </w:rPr>
+                        <m:t>priority</m:t>
+                      </m:r>
+                    </m:e>
+                    <m:sub>
+                      <m:r>
+                        <w:rPr>
+                          <w:rFonts w:ascii="Cambria Math" w:hAnsi="Cambria Math" w:cs="Courier New"/>
+                        </w:rPr>
+                        <m:t>o</m:t>
+                      </m:r>
+                    </m:sub>
+                  </m:sSub>
+                </m:e>
+              </m:nary>
+            </m:den>
+          </m:f>
+        </m:oMath>
+      </m:oMathPara>
+    </w:p>
+    <w:p>
+      <w:pPr>
+        <w:jc w:val="both"/>
+        <w:rPr>
+          <w:rFonts w:cs="Courier New"/>
+        </w:rPr>
+      </w:pPr>
+    </w:p>
+    <w:p>
+      <w:pPr>
+        <w:jc w:val="both"/>
+        <w:rPr>
+          <w:rFonts w:cs="Courier New"/>
+          <w:b/>
+          <w:u w:val="single"/>
+        </w:rPr>
+      </w:pPr>
+    </w:p>
+    <w:p>
+      <w:pPr>
+        <w:jc w:val="both"/>
+        <w:rPr>
+          <w:rFonts w:cs="Courier New"/>
+        </w:rPr>
+      </w:pPr>
+      <w:r>
+        <w:rPr>
+          <w:rFonts w:cs="Courier New"/>
+        </w:rPr>
+        <w:t>w</w:t>
+      </w:r>
+      <w:r>
+        <w:rPr>
+          <w:rFonts w:cs="Courier New"/>
+        </w:rPr>
+        <w:t>here</w:t>
+      </w:r>
+    </w:p>
+    <w:p>
+      <w:pPr>
+        <w:jc w:val="both"/>
+        <w:rPr>
+          <w:rFonts w:cs="Courier New"/>
+        </w:rPr>
+      </w:pPr>
+    </w:p>
+    <w:p>
+      <w:pPr>
+        <w:ind w:firstLine="720"/>
+        <w:jc w:val="both"/>
+        <w:rPr>
+          <w:rFonts w:cs="Courier New"/>
+        </w:rPr>
+      </w:pPr>
+      <w:r>
+        <w:rPr>
+          <w:rFonts w:cs="Courier New"/>
+        </w:rPr>
+        <w:t>OR= Set of Optimization requirements</w:t>
+      </w:r>
+    </w:p>
+    <w:p>
+      <w:pPr>
+        <w:jc w:val="both"/>
+        <w:rPr>
+          <w:rFonts w:cs="Courier New"/>
+        </w:rPr>
+      </w:pPr>
+      <w:r>
+        <w:rPr>
+          <w:rFonts w:cs="Courier New"/>
+        </w:rPr>
+        <w:t xml:space="preserve"> </w:t>
+      </w:r>
+      <w:r>
+        <w:rPr>
+          <w:rFonts w:cs="Courier New"/>
+        </w:rPr>
+        <w:tab/>
+      </w:r>
+      <w:r>
+        <w:rPr>
+          <w:rFonts w:cs="Courier New"/>
+        </w:rPr>
+        <w:t xml:space="preserve"> </w:t>
+      </w:r>
+      <w:r>
+        <w:rPr>
+          <w:rFonts w:cs="Courier New"/>
+        </w:rPr>
+        <w:t>priority</w:t>
+      </w:r>
+      <w:r>
+        <w:rPr>
+          <w:rFonts w:cs="Courier New"/>
+          <w:vertAlign w:val="subscript"/>
+        </w:rPr>
+        <w:t>o</w:t>
+      </w:r>
+      <w:r>
+        <w:rPr>
+          <w:rFonts w:cs="Courier New"/>
+        </w:rPr>
+        <w:t>= Priority o</w:t>
+      </w:r>
+      <w:r>
+        <w:rPr>
+          <w:rFonts w:cs="Courier New"/>
+        </w:rPr>
+        <w:t>f the Optimization requirement o</w:t>
+      </w:r>
+    </w:p>
+    <w:p>
+      <w:pPr>
+        <w:jc w:val="both"/>
+        <w:rPr>
+          <w:rFonts w:cs="Courier New"/>
+        </w:rPr>
+      </w:pPr>
+    </w:p>
+    <w:p>
+      <w:pPr>
+        <w:ind w:firstLine="720"/>
+        <w:jc w:val="both"/>
+        <w:rPr>
+          <w:rFonts w:cs="Courier New"/>
+        </w:rPr>
+      </w:pPr>
+      <w:r>
+        <w:rPr>
+          <w:rFonts w:cs="Courier New"/>
+        </w:rPr>
+        <w:t>A, B = Solutions for the Generated Constraint Problem</w:t>
+      </w:r>
+    </w:p>
+    <w:p>
+      <w:pPr>
+        <w:ind w:firstLine="720"/>
+        <w:jc w:val="both"/>
+        <w:rPr>
+          <w:rFonts w:cs="Courier New"/>
+        </w:rPr>
+      </w:pPr>
+    </w:p>
+    <w:p>
+      <w:pPr>
+        <w:ind w:firstLine="720"/>
+        <w:jc w:val="both"/>
+        <w:rPr>
+          <w:rFonts w:cs="Courier New"/>
+        </w:rPr>
+      </w:pPr>
+      <m:oMath>
+        <m:r>
+          <w:rPr>
+            <w:rFonts w:ascii="Cambria Math" w:hAnsi="Cambria Math" w:cs="Courier New"/>
+          </w:rPr>
+          <m:t>NormalisedUtilityDimension&lt;o&gt;</m:t>
+        </m:r>
+        <m:d>
+          <m:dPr>
+            <m:ctrlPr>
+              <w:rPr>
+                <w:rFonts w:ascii="Cambria Math" w:hAnsi="Cambria Math" w:cs="Courier New"/>
+                <w:i/>
+              </w:rPr>
+            </m:ctrlPr>
+          </m:dPr>
+          <m:e>
+            <m:r>
+              <w:rPr>
+                <w:rFonts w:ascii="Cambria Math" w:hAnsi="Cambria Math" w:cs="Courier New"/>
+              </w:rPr>
+              <m:t>A,B</m:t>
+            </m:r>
+          </m:e>
+        </m:d>
+        <m:r>
+          <w:rPr>
+            <w:rFonts w:ascii="Cambria Math" w:hAnsi="Cambria Math" w:cs="Courier New"/>
+          </w:rPr>
+          <m:t xml:space="preserve">= </m:t>
+        </m:r>
+        <m:f>
+          <m:fPr>
+            <m:ctrlPr>
+              <w:rPr>
+                <w:rFonts w:ascii="Cambria Math" w:hAnsi="Cambria Math" w:cs="Courier New"/>
+                <w:i/>
+              </w:rPr>
+            </m:ctrlPr>
+          </m:fPr>
+          <m:num>
+            <m:r>
+              <w:rPr>
+                <w:rFonts w:ascii="Cambria Math" w:hAnsi="Cambria Math" w:cs="Courier New"/>
+              </w:rPr>
+              <m:t>B.o</m:t>
+            </m:r>
+          </m:num>
+          <m:den>
+            <m:func>
+              <m:funcPr>
+                <m:ctrlPr>
+                  <w:rPr>
+                    <w:rFonts w:ascii="Cambria Math" w:hAnsi="Cambria Math" w:cs="Courier New"/>
+                  </w:rPr>
+                </m:ctrlPr>
+              </m:funcPr>
+              <m:fName>
+                <m:r>
+                  <m:rPr>
+                    <m:sty m:val="p"/>
+                  </m:rPr>
+                  <w:rPr>
+                    <w:rFonts w:ascii="Cambria Math" w:hAnsi="Cambria Math" w:cs="Courier New"/>
+                  </w:rPr>
+                  <m:t>max</m:t>
+                </m:r>
+              </m:fName>
+              <m:e>
+                <m:d>
+                  <m:dPr>
+                    <m:ctrlPr>
+                      <w:rPr>
+                        <w:rFonts w:ascii="Cambria Math" w:hAnsi="Cambria Math" w:cs="Courier New"/>
+                        <w:i/>
+                      </w:rPr>
+                    </m:ctrlPr>
+                  </m:dPr>
+                  <m:e>
+                    <m:r>
+                      <w:rPr>
+                        <w:rFonts w:ascii="Cambria Math" w:hAnsi="Cambria Math" w:cs="Courier New"/>
+                      </w:rPr>
+                      <m:t>A.o, B.o</m:t>
+                    </m:r>
+                  </m:e>
+                </m:d>
+              </m:e>
+            </m:func>
+            <m:r>
+              <w:rPr>
+                <w:rFonts w:ascii="Cambria Math" w:hAnsi="Cambria Math" w:cs="Courier New"/>
+              </w:rPr>
+              <m:t>-</m:t>
+            </m:r>
+            <m:func>
+              <m:funcPr>
+                <m:ctrlPr>
+                  <w:rPr>
+                    <w:rFonts w:ascii="Cambria Math" w:hAnsi="Cambria Math" w:cs="Courier New"/>
+                  </w:rPr>
+                </m:ctrlPr>
+              </m:funcPr>
+              <m:fName>
+                <m:r>
+                  <m:rPr>
+                    <m:sty m:val="p"/>
+                  </m:rPr>
+                  <w:rPr>
+                    <w:rFonts w:ascii="Cambria Math" w:hAnsi="Cambria Math" w:cs="Courier New"/>
+                  </w:rPr>
+                  <m:t>max</m:t>
+                </m:r>
+              </m:fName>
+              <m:e>
+                <m:d>
+                  <m:dPr>
+                    <m:ctrlPr>
+                      <w:rPr>
+                        <w:rFonts w:ascii="Cambria Math" w:hAnsi="Cambria Math" w:cs="Courier New"/>
+                        <w:i/>
+                      </w:rPr>
+                    </m:ctrlPr>
+                  </m:dPr>
+                  <m:e>
+                    <m:r>
+                      <w:rPr>
+                        <w:rFonts w:ascii="Cambria Math" w:hAnsi="Cambria Math" w:cs="Courier New"/>
+                      </w:rPr>
+                      <m:t>A.</m:t>
+                    </m:r>
+                    <m:r>
+                      <w:rPr>
+                        <w:rFonts w:ascii="Cambria Math" w:hAnsi="Cambria Math" w:cs="Courier New"/>
+                      </w:rPr>
+                      <m:t>o</m:t>
+                    </m:r>
+                    <m:r>
+                      <w:rPr>
+                        <w:rFonts w:ascii="Cambria Math" w:hAnsi="Cambria Math" w:cs="Courier New"/>
+                      </w:rPr>
+                      <m:t>, B.</m:t>
+                    </m:r>
+                    <m:r>
+                      <w:rPr>
+                        <w:rFonts w:ascii="Cambria Math" w:hAnsi="Cambria Math" w:cs="Courier New"/>
+                      </w:rPr>
+                      <m:t>o</m:t>
+                    </m:r>
+                  </m:e>
+                </m:d>
+              </m:e>
+            </m:func>
+          </m:den>
+        </m:f>
+      </m:oMath>
+      <w:r>
+        <w:rPr>
+          <w:rFonts w:cs="Courier New"/>
+        </w:rPr>
+        <w:t xml:space="preserve"> </w:t>
+      </w:r>
+    </w:p>
+    <w:p>
+      <w:pPr>
+        <w:jc w:val="both"/>
+        <w:rPr>
+          <w:rFonts w:cs="Courier New"/>
+          <w:b/>
+          <w:u w:val="single"/>
+        </w:rPr>
+      </w:pPr>
+    </w:p>
+    <w:p>
+      <w:pPr>
+        <w:jc w:val="both"/>
+        <w:rPr>
+          <w:rFonts w:cs="Courier New"/>
+          <w:b/>
+          <w:u w:val="single"/>
+        </w:rPr>
+      </w:pPr>
+    </w:p>
+    <w:p>
+      <w:pPr>
+        <w:jc w:val="both"/>
+        <w:rPr>
+          <w:rFonts w:cs="Courier New"/>
+        </w:rPr>
+      </w:pPr>
+      <w:r>
+        <w:rPr>
+          <w:rFonts w:cs="Courier New"/>
+        </w:rPr>
+        <w:tab/>
+        <w:t>A.o= The value the optimization requirement o by using</w:t>
+      </w:r>
+      <w:r>
+        <w:rPr>
+          <w:rFonts w:cs="Courier New"/>
+        </w:rPr>
+        <w:t xml:space="preserve"> the solution A</w:t>
+      </w:r>
+      <w:r>
+        <w:rPr>
+          <w:rFonts w:cs="Courier New"/>
+        </w:rPr>
+        <w:t xml:space="preserve"> </w:t>
+      </w:r>
+    </w:p>
+    <w:p>
+      <w:pPr>
+        <w:jc w:val="both"/>
+        <w:rPr>
+          <w:rFonts w:cs="Courier New"/>
+        </w:rPr>
+      </w:pPr>
+      <w:bookmarkStart w:id="0" w:name="_GoBack"/>
+      <w:bookmarkEnd w:id="0"/>
+      <w:r>
+        <w:rPr>
+          <w:rFonts w:cs="Courier New"/>
+        </w:rPr>
+        <w:tab/>
+      </w:r>
+    </w:p>
+    <w:p>
+      <w:pPr>
+        <w:jc w:val="both"/>
+        <w:rPr>
+          <w:rFonts w:cs="Courier New"/>
+          <w:b/>
+          <w:u w:val="single"/>
         </w:rPr>
       </w:pPr>
     </w:p>

</xml_diff>